<commit_message>
docs: add GitHub update screenshot to experiment 3 report
</commit_message>
<xml_diff>
--- a/docs/experiment3/实验3报告_标准模板版.docx
+++ b/docs/experiment3/实验3报告_标准模板版.docx
@@ -1879,6 +1879,391 @@
           <w:tbl>
             <w:tblPr>
               <w:tblW w:type="auto" w:w="0"/>
+              <w:tblLayout w:type="fixed"/>
+              <w:tblLook w:firstColumn="1" w:firstRow="1" w:lastColumn="0" w:lastRow="0" w:noHBand="0" w:noVBand="1" w:val="04A0"/>
+            </w:tblPr>
+            <w:tblGrid>
+              <w:gridCol w:w="9576"/>
+            </w:tblGrid>
+            <w:tr>
+              <w:trPr>
+                <w:cantSplit/>
+              </w:trPr>
+              <w:tc>
+                <w:tcPr>
+                  <w:tcW w:type="dxa" w:w="9900"/>
+                </w:tcPr>
+                <w:p>
+                  <w:pPr>
+                    <w:spacing w:before="0" w:after="100" w:line="276" w:lineRule="auto"/>
+                    <w:jc w:val="center"/>
+                    <w:snapToGrid w:val="0"/>
+                  </w:pPr>
+                  <w:r>
+                    <w:rPr>
+                      <w:rFonts w:ascii="宋体" w:hAnsi="宋体" w:eastAsia="宋体"/>
+                      <w:b/>
+                      <w:sz w:val="28"/>
+                    </w:rPr>
+                    <w:t>图 9  GitHub 仓库更新记录</w:t>
+                  </w:r>
+                </w:p>
+                <w:p>
+                  <w:pPr>
+                    <w:spacing w:before="0" w:after="100" w:line="276" w:lineRule="auto"/>
+                    <w:jc w:val="left"/>
+                    <w:snapToGrid w:val="0"/>
+                  </w:pPr>
+                  <w:r>
+                    <w:rPr>
+                      <w:rFonts w:ascii="宋体" w:hAnsi="宋体" w:eastAsia="宋体"/>
+                      <w:b w:val="0"/>
+                      <w:sz w:val="28"/>
+                    </w:rPr>
+                    <w:t>在 Edge 中打开 rbg-324/CPP-training 的 exp3-final 分支。图中可见近期推送提示、分支名称，以及作者 rbg-324 的提交 0dc35ab，说明为完成实验三模板报告和阶段证据；src 目录的更新说明为实现倒车模式并通过 27 项用例。可据此核对远端保存的实验三代码与报告。</w:t>
+                  </w:r>
+                </w:p>
+                <w:p>
+                  <w:pPr>
+                    <w:spacing w:before="0" w:after="120" w:line="276" w:lineRule="auto"/>
+                    <w:jc w:val="center"/>
+                    <w:snapToGrid w:val="0"/>
+                  </w:pPr>
+                  <w:r>
+                    <w:drawing>
+                      <wp:inline xmlns:a="http://schemas.openxmlformats.org/drawingml/2006/main" xmlns:pic="http://schemas.openxmlformats.org/drawingml/2006/picture">
+                        <wp:extent cx="5029200" cy="3143618"/>
+                        <wp:docPr id="9" name="Picture 9"/>
+                        <wp:cNvGraphicFramePr>
+                          <a:graphicFrameLocks noChangeAspect="1"/>
+                        </wp:cNvGraphicFramePr>
+                        <a:graphic>
+                          <a:graphicData uri="http://schemas.openxmlformats.org/drawingml/2006/picture">
+                            <pic:pic>
+                              <pic:nvPicPr>
+                                <pic:cNvPr id="0" name="09-github-update.png"/>
+                                <pic:cNvPicPr/>
+                              </pic:nvPicPr>
+                              <pic:blipFill>
+                                <a:blip r:embed="rId17"/>
+                                <a:stretch>
+                                  <a:fillRect/>
+                                </a:stretch>
+                              </pic:blipFill>
+                              <pic:spPr>
+                                <a:xfrm>
+                                  <a:off x="0" y="0"/>
+                                  <a:ext cx="5029200" cy="3143618"/>
+                                </a:xfrm>
+                                <a:prstGeom prst="rect"/>
+                              </pic:spPr>
+                            </pic:pic>
+                          </a:graphicData>
+                        </a:graphic>
+                      </wp:inline>
+                    </w:drawing>
+                  </w:r>
+                </w:p>
+                <w:p>
+                  <w:pPr>
+                    <w:spacing w:before="0" w:after="60" w:line="276" w:lineRule="auto"/>
+                    <w:jc w:val="left"/>
+                    <w:snapToGrid w:val="0"/>
+                  </w:pPr>
+                  <w:r>
+                    <w:rPr>
+                      <w:rFonts w:ascii="宋体" w:hAnsi="宋体" w:eastAsia="宋体"/>
+                      <w:b/>
+                      <w:sz w:val="28"/>
+                    </w:rPr>
+                    <w:t>实验三分支与对应内容</w:t>
+                  </w:r>
+                </w:p>
+                <w:tbl>
+                  <w:tblPr>
+                    <w:tblW w:type="auto" w:w="0"/>
+                    <w:tblLayout w:type="fixed"/>
+                    <w:tblLook w:firstColumn="1" w:firstRow="1" w:lastColumn="0" w:lastRow="0" w:noHBand="0" w:noVBand="1" w:val="04A0"/>
+                    <w:tblBorders>
+                      <w:top w:val="single" w:sz="4" w:color="000000"/>
+                      <w:left w:val="single" w:sz="4" w:color="000000"/>
+                      <w:bottom w:val="single" w:sz="4" w:color="000000"/>
+                      <w:right w:val="single" w:sz="4" w:color="000000"/>
+                      <w:insideH w:val="single" w:sz="4" w:color="000000"/>
+                      <w:insideV w:val="single" w:sz="4" w:color="000000"/>
+                    </w:tblBorders>
+                  </w:tblPr>
+                  <w:tblGrid>
+                    <w:gridCol w:w="4950"/>
+                    <w:gridCol w:w="4950"/>
+                  </w:tblGrid>
+                  <w:tr>
+                    <w:tc>
+                      <w:tcPr>
+                        <w:tcW w:type="dxa" w:w="3456"/>
+                      </w:tcPr>
+                      <w:p>
+                        <w:pPr>
+                          <w:spacing w:before="0" w:after="60" w:line="276" w:lineRule="auto"/>
+                          <w:jc w:val="left"/>
+                          <w:snapToGrid w:val="0"/>
+                        </w:pPr>
+                        <w:r>
+                          <w:rPr>
+                            <w:rFonts w:ascii="宋体" w:hAnsi="宋体" w:eastAsia="宋体"/>
+                            <w:b/>
+                            <w:sz w:val="28"/>
+                          </w:rPr>
+                          <w:t>GitHub 分支</w:t>
+                        </w:r>
+                      </w:p>
+                    </w:tc>
+                    <w:tc>
+                      <w:tcPr>
+                        <w:tcW w:type="dxa" w:w="5904"/>
+                      </w:tcPr>
+                      <w:p>
+                        <w:pPr>
+                          <w:spacing w:before="0" w:after="60" w:line="276" w:lineRule="auto"/>
+                          <w:jc w:val="left"/>
+                          <w:snapToGrid w:val="0"/>
+                        </w:pPr>
+                        <w:r>
+                          <w:rPr>
+                            <w:rFonts w:ascii="宋体" w:hAnsi="宋体" w:eastAsia="宋体"/>
+                            <w:b/>
+                            <w:sz w:val="28"/>
+                          </w:rPr>
+                          <w:t>对应内容</w:t>
+                        </w:r>
+                      </w:p>
+                    </w:tc>
+                  </w:tr>
+                  <w:tr>
+                    <w:tc>
+                      <w:tcPr>
+                        <w:tcW w:type="dxa" w:w="3456"/>
+                      </w:tcPr>
+                      <w:p>
+                        <w:pPr>
+                          <w:spacing w:before="0" w:after="60" w:line="276" w:lineRule="auto"/>
+                          <w:jc w:val="left"/>
+                          <w:snapToGrid w:val="0"/>
+                        </w:pPr>
+                        <w:r>
+                          <w:rPr>
+                            <w:rFonts w:ascii="宋体" w:hAnsi="宋体" w:eastAsia="宋体"/>
+                            <w:b w:val="0"/>
+                            <w:sz w:val="28"/>
+                          </w:rPr>
+                          <w:t>exp3-decouple</w:t>
+                        </w:r>
+                      </w:p>
+                    </w:tc>
+                    <w:tc>
+                      <w:tcPr>
+                        <w:tcW w:type="dxa" w:w="5904"/>
+                      </w:tcPr>
+                      <w:p>
+                        <w:pPr>
+                          <w:spacing w:before="0" w:after="60" w:line="276" w:lineRule="auto"/>
+                          <w:jc w:val="left"/>
+                          <w:snapToGrid w:val="0"/>
+                        </w:pPr>
+                        <w:r>
+                          <w:rPr>
+                            <w:rFonts w:ascii="宋体" w:hAnsi="宋体" w:eastAsia="宋体"/>
+                            <w:b w:val="0"/>
+                            <w:sz w:val="28"/>
+                          </w:rPr>
+                          <w:t>状态抽离与循环依赖解耦</w:t>
+                        </w:r>
+                      </w:p>
+                    </w:tc>
+                  </w:tr>
+                  <w:tr>
+                    <w:tc>
+                      <w:tcPr>
+                        <w:tcW w:type="dxa" w:w="3456"/>
+                      </w:tcPr>
+                      <w:p>
+                        <w:pPr>
+                          <w:spacing w:before="0" w:after="60" w:line="276" w:lineRule="auto"/>
+                          <w:jc w:val="left"/>
+                          <w:snapToGrid w:val="0"/>
+                        </w:pPr>
+                        <w:r>
+                          <w:rPr>
+                            <w:rFonts w:ascii="宋体" w:hAnsi="宋体" w:eastAsia="宋体"/>
+                            <w:b w:val="0"/>
+                            <w:sz w:val="28"/>
+                          </w:rPr>
+                          <w:t>exp3-table</w:t>
+                        </w:r>
+                      </w:p>
+                    </w:tc>
+                    <w:tc>
+                      <w:tcPr>
+                        <w:tcW w:type="dxa" w:w="5904"/>
+                      </w:tcPr>
+                      <w:p>
+                        <w:pPr>
+                          <w:spacing w:before="0" w:after="60" w:line="276" w:lineRule="auto"/>
+                          <w:jc w:val="left"/>
+                          <w:snapToGrid w:val="0"/>
+                        </w:pPr>
+                        <w:r>
+                          <w:rPr>
+                            <w:rFonts w:ascii="宋体" w:hAnsi="宋体" w:eastAsia="宋体"/>
+                            <w:b w:val="0"/>
+                            <w:sz w:val="28"/>
+                          </w:rPr>
+                          <w:t>表驱动及方向状态简化</w:t>
+                        </w:r>
+                      </w:p>
+                    </w:tc>
+                  </w:tr>
+                  <w:tr>
+                    <w:tc>
+                      <w:tcPr>
+                        <w:tcW w:type="dxa" w:w="3456"/>
+                      </w:tcPr>
+                      <w:p>
+                        <w:pPr>
+                          <w:spacing w:before="0" w:after="60" w:line="276" w:lineRule="auto"/>
+                          <w:jc w:val="left"/>
+                          <w:snapToGrid w:val="0"/>
+                        </w:pPr>
+                        <w:r>
+                          <w:rPr>
+                            <w:rFonts w:ascii="宋体" w:hAnsi="宋体" w:eastAsia="宋体"/>
+                            <w:b w:val="0"/>
+                            <w:sz w:val="28"/>
+                          </w:rPr>
+                          <w:t>exp3-functional</w:t>
+                        </w:r>
+                      </w:p>
+                    </w:tc>
+                    <w:tc>
+                      <w:tcPr>
+                        <w:tcW w:type="dxa" w:w="5904"/>
+                      </w:tcPr>
+                      <w:p>
+                        <w:pPr>
+                          <w:spacing w:before="0" w:after="60" w:line="276" w:lineRule="auto"/>
+                          <w:jc w:val="left"/>
+                          <w:snapToGrid w:val="0"/>
+                        </w:pPr>
+                        <w:r>
+                          <w:rPr>
+                            <w:rFonts w:ascii="宋体" w:hAnsi="宋体" w:eastAsia="宋体"/>
+                            <w:b w:val="0"/>
+                            <w:sz w:val="28"/>
+                          </w:rPr>
+                          <w:t>lambda 与 operator() 函数对象</w:t>
+                        </w:r>
+                      </w:p>
+                    </w:tc>
+                  </w:tr>
+                  <w:tr>
+                    <w:tc>
+                      <w:tcPr>
+                        <w:tcW w:type="dxa" w:w="3456"/>
+                      </w:tcPr>
+                      <w:p>
+                        <w:pPr>
+                          <w:spacing w:before="0" w:after="60" w:line="276" w:lineRule="auto"/>
+                          <w:jc w:val="left"/>
+                          <w:snapToGrid w:val="0"/>
+                        </w:pPr>
+                        <w:r>
+                          <w:rPr>
+                            <w:rFonts w:ascii="宋体" w:hAnsi="宋体" w:eastAsia="宋体"/>
+                            <w:b w:val="0"/>
+                            <w:sz w:val="28"/>
+                          </w:rPr>
+                          <w:t>exp3-reverse-tests</w:t>
+                        </w:r>
+                      </w:p>
+                    </w:tc>
+                    <w:tc>
+                      <w:tcPr>
+                        <w:tcW w:type="dxa" w:w="5904"/>
+                      </w:tcPr>
+                      <w:p>
+                        <w:pPr>
+                          <w:spacing w:before="0" w:after="60" w:line="276" w:lineRule="auto"/>
+                          <w:jc w:val="left"/>
+                          <w:snapToGrid w:val="0"/>
+                        </w:pPr>
+                        <w:r>
+                          <w:rPr>
+                            <w:rFonts w:ascii="宋体" w:hAnsi="宋体" w:eastAsia="宋体"/>
+                            <w:b w:val="0"/>
+                            <w:sz w:val="28"/>
+                          </w:rPr>
+                          <w:t>B 指令实现前的新增测试</w:t>
+                        </w:r>
+                      </w:p>
+                    </w:tc>
+                  </w:tr>
+                  <w:tr>
+                    <w:tc>
+                      <w:tcPr>
+                        <w:tcW w:type="dxa" w:w="3456"/>
+                      </w:tcPr>
+                      <w:p>
+                        <w:pPr>
+                          <w:spacing w:before="0" w:after="60" w:line="276" w:lineRule="auto"/>
+                          <w:jc w:val="left"/>
+                          <w:snapToGrid w:val="0"/>
+                        </w:pPr>
+                        <w:r>
+                          <w:rPr>
+                            <w:rFonts w:ascii="宋体" w:hAnsi="宋体" w:eastAsia="宋体"/>
+                            <w:b w:val="0"/>
+                            <w:sz w:val="28"/>
+                          </w:rPr>
+                          <w:t>exp3-final</w:t>
+                        </w:r>
+                      </w:p>
+                    </w:tc>
+                    <w:tc>
+                      <w:tcPr>
+                        <w:tcW w:type="dxa" w:w="5904"/>
+                      </w:tcPr>
+                      <w:p>
+                        <w:pPr>
+                          <w:spacing w:before="0" w:after="60" w:line="276" w:lineRule="auto"/>
+                          <w:jc w:val="left"/>
+                          <w:snapToGrid w:val="0"/>
+                        </w:pPr>
+                        <w:r>
+                          <w:rPr>
+                            <w:rFonts w:ascii="宋体" w:hAnsi="宋体" w:eastAsia="宋体"/>
+                            <w:b w:val="0"/>
+                            <w:sz w:val="28"/>
+                          </w:rPr>
+                          <w:t>B/BF 实现、27 项通过及实验报告</w:t>
+                        </w:r>
+                      </w:p>
+                    </w:tc>
+                  </w:tr>
+                </w:tbl>
+                <w:p/>
+              </w:tc>
+            </w:tr>
+          </w:tbl>
+          <w:p>
+            <w:pPr>
+              <w:spacing w:before="0" w:after="100" w:line="276" w:lineRule="auto"/>
+              <w:jc w:val="left"/>
+              <w:snapToGrid w:val="0"/>
+            </w:pPr>
+          </w:p>
+          <w:tbl>
+            <w:tblPr>
+              <w:tblW w:type="auto" w:w="0"/>
               <w:tblLook w:firstColumn="1" w:firstRow="1" w:lastColumn="0" w:lastRow="0" w:noHBand="0" w:noVBand="1" w:val="04A0"/>
             </w:tblPr>
             <w:tblGrid>

</xml_diff>